<commit_message>
docs: agregar sección de soluciones para reducir el consumo al informe técnico
- Nueva sección 7 "Soluciones para reducir el consumo": siete medidas de
  ahorro a evaluar con el simulador (variadores de frecuencia, motores IE3 a
  IE4, consumo en espera, horarios de operación, desplazamiento de carga fuera
  de punta, control por ocupación y monitoreo con medidores SENTRON).
- Se plantean como hipótesis, sin porcentajes de ahorro, porque falta una
  referencia que los respalde; los equipos críticos quedan excluidos.
- Se eliminan las secciones de Revisión técnica y Pendientes (el informe es de
  uso interno del equipo, no una entrega oficial).
- Se ajustan los saltos de página y el espaciado de tablas y listas.
- Se actualizan Informe_Tecnico_SPACEWISE_AI.docx y .pdf (5 páginas).
</commit_message>
<xml_diff>
--- a/docs/Informe_Tecnico_SPACEWISE_AI.docx
+++ b/docs/Informe_Tecnico_SPACEWISE_AI.docx
@@ -4912,1495 +4912,6 @@
           <w:szCs w:val="21"/>
         </w:rPr>
         <w:t xml:space="preserve">Las directrices iniciales del proyecto traían porcentajes preliminares de ahorro por subsistema para el edificio del CEN. No se usan aquí, porque no tienen una referencia y corresponden al caso anterior.</w:t>
-      </w:r>
-    </w:p>
-    <w:p>
-      <w:pPr>
-        <w:pStyle w:val="Heading1"/>
-        <w:keepNext/>
-        <w:pageBreakBefore/>
-        <w:spacing w:after="120" w:before="300"/>
-      </w:pPr>
-      <w:r>
-        <w:rPr>
-          <w:rFonts w:ascii="Calibri" w:cs="Calibri" w:eastAsia="Calibri" w:hAnsi="Calibri"/>
-          <w:b/>
-          <w:bCs/>
-          <w:color w:val="1F4E79"/>
-          <w:sz w:val="28"/>
-          <w:szCs w:val="28"/>
-        </w:rPr>
-        <w:t xml:space="preserve">8. Revisión técnica</w:t>
-      </w:r>
-    </w:p>
-    <w:p>
-      <w:pPr>
-        <w:keepNext/>
-        <w:spacing w:after="120" w:line="280"/>
-      </w:pPr>
-      <w:r>
-        <w:rPr>
-          <w:rFonts w:ascii="Calibri" w:cs="Calibri" w:eastAsia="Calibri" w:hAnsi="Calibri"/>
-          <w:sz w:val="21"/>
-          <w:szCs w:val="21"/>
-        </w:rPr>
-        <w:t xml:space="preserve">Al revisar los últimos cambios encontramos problemas que explicaban por qué el dashboard no aparecía. Los corregidos se probaron con las pruebas de Python y una ejecución completa del orquestador con un MATLAB simulado.</w:t>
-      </w:r>
-    </w:p>
-    <w:tbl>
-      <w:tblPr>
-        <w:tblW w:type="dxa" w:w="9638"/>
-        <w:tblBorders>
-          <w:top w:val="single" w:color="auto" w:sz="4"/>
-          <w:left w:val="single" w:color="auto" w:sz="4"/>
-          <w:bottom w:val="single" w:color="auto" w:sz="4"/>
-          <w:right w:val="single" w:color="auto" w:sz="4"/>
-          <w:insideH w:val="single" w:color="auto" w:sz="4"/>
-          <w:insideV w:val="single" w:color="auto" w:sz="4"/>
-        </w:tblBorders>
-      </w:tblPr>
-      <w:tblGrid>
-        <w:gridCol w:w="450"/>
-        <w:gridCol w:w="5188"/>
-        <w:gridCol w:w="4000"/>
-      </w:tblGrid>
-      <w:tr>
-        <w:trPr>
-          <w:cantSplit/>
-          <w:tblHeader/>
-        </w:trPr>
-        <w:tc>
-          <w:tcPr>
-            <w:tcW w:type="dxa" w:w="450"/>
-            <w:tcBorders>
-              <w:top w:val="single" w:color="C8C8C8" w:sz="4"/>
-              <w:left w:val="single" w:color="C8C8C8" w:sz="4"/>
-              <w:bottom w:val="single" w:color="C8C8C8" w:sz="4"/>
-              <w:right w:val="single" w:color="C8C8C8" w:sz="4"/>
-            </w:tcBorders>
-            <w:shd w:fill="1F4E79" w:color="auto" w:val="clear"/>
-            <w:tcMar>
-              <w:top w:type="dxa" w:w="80"/>
-              <w:left w:type="dxa" w:w="120"/>
-              <w:bottom w:type="dxa" w:w="80"/>
-              <w:right w:type="dxa" w:w="120"/>
-            </w:tcMar>
-          </w:tcPr>
-          <w:p>
-            <w:pPr>
-              <w:keepNext/>
-              <w:spacing w:line="264"/>
-              <w:jc w:val="left"/>
-            </w:pPr>
-            <w:r>
-              <w:rPr>
-                <w:rFonts w:ascii="Calibri" w:cs="Calibri" w:eastAsia="Calibri" w:hAnsi="Calibri"/>
-                <w:b/>
-                <w:bCs/>
-                <w:color w:val="FFFFFF"/>
-                <w:sz w:val="19"/>
-                <w:szCs w:val="19"/>
-              </w:rPr>
-              <w:t xml:space="preserve">N°</w:t>
-            </w:r>
-          </w:p>
-        </w:tc>
-        <w:tc>
-          <w:tcPr>
-            <w:tcW w:type="dxa" w:w="5188"/>
-            <w:tcBorders>
-              <w:top w:val="single" w:color="C8C8C8" w:sz="4"/>
-              <w:left w:val="single" w:color="C8C8C8" w:sz="4"/>
-              <w:bottom w:val="single" w:color="C8C8C8" w:sz="4"/>
-              <w:right w:val="single" w:color="C8C8C8" w:sz="4"/>
-            </w:tcBorders>
-            <w:shd w:fill="1F4E79" w:color="auto" w:val="clear"/>
-            <w:tcMar>
-              <w:top w:type="dxa" w:w="80"/>
-              <w:left w:type="dxa" w:w="120"/>
-              <w:bottom w:type="dxa" w:w="80"/>
-              <w:right w:type="dxa" w:w="120"/>
-            </w:tcMar>
-          </w:tcPr>
-          <w:p>
-            <w:pPr>
-              <w:keepNext/>
-              <w:spacing w:line="264"/>
-              <w:jc w:val="left"/>
-            </w:pPr>
-            <w:r>
-              <w:rPr>
-                <w:rFonts w:ascii="Calibri" w:cs="Calibri" w:eastAsia="Calibri" w:hAnsi="Calibri"/>
-                <w:b/>
-                <w:bCs/>
-                <w:color w:val="FFFFFF"/>
-                <w:sz w:val="19"/>
-                <w:szCs w:val="19"/>
-              </w:rPr>
-              <w:t xml:space="preserve">Problema</w:t>
-            </w:r>
-          </w:p>
-        </w:tc>
-        <w:tc>
-          <w:tcPr>
-            <w:tcW w:type="dxa" w:w="4000"/>
-            <w:tcBorders>
-              <w:top w:val="single" w:color="C8C8C8" w:sz="4"/>
-              <w:left w:val="single" w:color="C8C8C8" w:sz="4"/>
-              <w:bottom w:val="single" w:color="C8C8C8" w:sz="4"/>
-              <w:right w:val="single" w:color="C8C8C8" w:sz="4"/>
-            </w:tcBorders>
-            <w:shd w:fill="1F4E79" w:color="auto" w:val="clear"/>
-            <w:tcMar>
-              <w:top w:type="dxa" w:w="80"/>
-              <w:left w:type="dxa" w:w="120"/>
-              <w:bottom w:type="dxa" w:w="80"/>
-              <w:right w:type="dxa" w:w="120"/>
-            </w:tcMar>
-          </w:tcPr>
-          <w:p>
-            <w:pPr>
-              <w:keepNext/>
-              <w:spacing w:line="264"/>
-              <w:jc w:val="left"/>
-            </w:pPr>
-            <w:r>
-              <w:rPr>
-                <w:rFonts w:ascii="Calibri" w:cs="Calibri" w:eastAsia="Calibri" w:hAnsi="Calibri"/>
-                <w:b/>
-                <w:bCs/>
-                <w:color w:val="FFFFFF"/>
-                <w:sz w:val="19"/>
-                <w:szCs w:val="19"/>
-              </w:rPr>
-              <w:t xml:space="preserve">Estado</w:t>
-            </w:r>
-          </w:p>
-        </w:tc>
-      </w:tr>
-      <w:tr>
-        <w:trPr>
-          <w:cantSplit/>
-        </w:trPr>
-        <w:tc>
-          <w:tcPr>
-            <w:tcW w:type="dxa" w:w="450"/>
-            <w:tcBorders>
-              <w:top w:val="single" w:color="C8C8C8" w:sz="4"/>
-              <w:left w:val="single" w:color="C8C8C8" w:sz="4"/>
-              <w:bottom w:val="single" w:color="C8C8C8" w:sz="4"/>
-              <w:right w:val="single" w:color="C8C8C8" w:sz="4"/>
-            </w:tcBorders>
-            <w:tcMar>
-              <w:top w:type="dxa" w:w="80"/>
-              <w:left w:type="dxa" w:w="120"/>
-              <w:bottom w:type="dxa" w:w="80"/>
-              <w:right w:type="dxa" w:w="120"/>
-            </w:tcMar>
-          </w:tcPr>
-          <w:p>
-            <w:pPr>
-              <w:keepNext w:val="false"/>
-              <w:spacing w:line="264"/>
-              <w:jc w:val="left"/>
-            </w:pPr>
-            <w:r>
-              <w:rPr>
-                <w:rFonts w:ascii="Calibri" w:cs="Calibri" w:eastAsia="Calibri" w:hAnsi="Calibri"/>
-                <w:b w:val="false"/>
-                <w:bCs w:val="false"/>
-                <w:sz w:val="19"/>
-                <w:szCs w:val="19"/>
-              </w:rPr>
-              <w:t xml:space="preserve">1</w:t>
-            </w:r>
-          </w:p>
-        </w:tc>
-        <w:tc>
-          <w:tcPr>
-            <w:tcW w:type="dxa" w:w="5188"/>
-            <w:tcBorders>
-              <w:top w:val="single" w:color="C8C8C8" w:sz="4"/>
-              <w:left w:val="single" w:color="C8C8C8" w:sz="4"/>
-              <w:bottom w:val="single" w:color="C8C8C8" w:sz="4"/>
-              <w:right w:val="single" w:color="C8C8C8" w:sz="4"/>
-            </w:tcBorders>
-            <w:tcMar>
-              <w:top w:type="dxa" w:w="80"/>
-              <w:left w:type="dxa" w:w="120"/>
-              <w:bottom w:type="dxa" w:w="80"/>
-              <w:right w:type="dxa" w:w="120"/>
-            </w:tcMar>
-          </w:tcPr>
-          <w:p>
-            <w:pPr>
-              <w:keepNext w:val="false"/>
-              <w:spacing w:line="264"/>
-              <w:jc w:val="left"/>
-            </w:pPr>
-            <w:r>
-              <w:rPr>
-                <w:rFonts w:ascii="Calibri" w:cs="Calibri" w:eastAsia="Calibri" w:hAnsi="Calibri"/>
-                <w:b w:val="false"/>
-                <w:bCs w:val="false"/>
-                <w:sz w:val="19"/>
-                <w:szCs w:val="19"/>
-              </w:rPr>
-              <w:t xml:space="preserve">Flask no servía el dashboard: http://localhost:5000 respondía 404.</w:t>
-            </w:r>
-          </w:p>
-        </w:tc>
-        <w:tc>
-          <w:tcPr>
-            <w:tcW w:type="dxa" w:w="4000"/>
-            <w:tcBorders>
-              <w:top w:val="single" w:color="C8C8C8" w:sz="4"/>
-              <w:left w:val="single" w:color="C8C8C8" w:sz="4"/>
-              <w:bottom w:val="single" w:color="C8C8C8" w:sz="4"/>
-              <w:right w:val="single" w:color="C8C8C8" w:sz="4"/>
-            </w:tcBorders>
-            <w:tcMar>
-              <w:top w:type="dxa" w:w="80"/>
-              <w:left w:type="dxa" w:w="120"/>
-              <w:bottom w:type="dxa" w:w="80"/>
-              <w:right w:type="dxa" w:w="120"/>
-            </w:tcMar>
-          </w:tcPr>
-          <w:p>
-            <w:pPr>
-              <w:keepNext w:val="false"/>
-              <w:spacing w:line="264"/>
-              <w:jc w:val="left"/>
-            </w:pPr>
-            <w:r>
-              <w:rPr>
-                <w:rFonts w:ascii="Calibri" w:cs="Calibri" w:eastAsia="Calibri" w:hAnsi="Calibri"/>
-                <w:b w:val="false"/>
-                <w:bCs w:val="false"/>
-                <w:sz w:val="19"/>
-                <w:szCs w:val="19"/>
-              </w:rPr>
-              <w:t xml:space="preserve">Corregido: ahora sirve index.html en la raíz</w:t>
-            </w:r>
-          </w:p>
-        </w:tc>
-      </w:tr>
-      <w:tr>
-        <w:trPr>
-          <w:cantSplit/>
-        </w:trPr>
-        <w:tc>
-          <w:tcPr>
-            <w:tcW w:type="dxa" w:w="450"/>
-            <w:tcBorders>
-              <w:top w:val="single" w:color="C8C8C8" w:sz="4"/>
-              <w:left w:val="single" w:color="C8C8C8" w:sz="4"/>
-              <w:bottom w:val="single" w:color="C8C8C8" w:sz="4"/>
-              <w:right w:val="single" w:color="C8C8C8" w:sz="4"/>
-            </w:tcBorders>
-            <w:shd w:fill="F3F6FA" w:color="auto" w:val="clear"/>
-            <w:tcMar>
-              <w:top w:type="dxa" w:w="80"/>
-              <w:left w:type="dxa" w:w="120"/>
-              <w:bottom w:type="dxa" w:w="80"/>
-              <w:right w:type="dxa" w:w="120"/>
-            </w:tcMar>
-          </w:tcPr>
-          <w:p>
-            <w:pPr>
-              <w:keepNext w:val="false"/>
-              <w:spacing w:line="264"/>
-              <w:jc w:val="left"/>
-            </w:pPr>
-            <w:r>
-              <w:rPr>
-                <w:rFonts w:ascii="Calibri" w:cs="Calibri" w:eastAsia="Calibri" w:hAnsi="Calibri"/>
-                <w:b w:val="false"/>
-                <w:bCs w:val="false"/>
-                <w:sz w:val="19"/>
-                <w:szCs w:val="19"/>
-              </w:rPr>
-              <w:t xml:space="preserve">2</w:t>
-            </w:r>
-          </w:p>
-        </w:tc>
-        <w:tc>
-          <w:tcPr>
-            <w:tcW w:type="dxa" w:w="5188"/>
-            <w:tcBorders>
-              <w:top w:val="single" w:color="C8C8C8" w:sz="4"/>
-              <w:left w:val="single" w:color="C8C8C8" w:sz="4"/>
-              <w:bottom w:val="single" w:color="C8C8C8" w:sz="4"/>
-              <w:right w:val="single" w:color="C8C8C8" w:sz="4"/>
-            </w:tcBorders>
-            <w:shd w:fill="F3F6FA" w:color="auto" w:val="clear"/>
-            <w:tcMar>
-              <w:top w:type="dxa" w:w="80"/>
-              <w:left w:type="dxa" w:w="120"/>
-              <w:bottom w:type="dxa" w:w="80"/>
-              <w:right w:type="dxa" w:w="120"/>
-            </w:tcMar>
-          </w:tcPr>
-          <w:p>
-            <w:pPr>
-              <w:keepNext w:val="false"/>
-              <w:spacing w:line="264"/>
-              <w:jc w:val="left"/>
-            </w:pPr>
-            <w:r>
-              <w:rPr>
-                <w:rFonts w:ascii="Calibri" w:cs="Calibri" w:eastAsia="Calibri" w:hAnsi="Calibri"/>
-                <w:b w:val="false"/>
-                <w:bCs w:val="false"/>
-                <w:sz w:val="19"/>
-                <w:szCs w:val="19"/>
-              </w:rPr>
-              <w:t xml:space="preserve">La simulación continua nunca se veía: el dashboard listaba solo simulaciones completadas y el resumen daba 404 porque ese modo no guarda resultados finales.</w:t>
-            </w:r>
-          </w:p>
-        </w:tc>
-        <w:tc>
-          <w:tcPr>
-            <w:tcW w:type="dxa" w:w="4000"/>
-            <w:tcBorders>
-              <w:top w:val="single" w:color="C8C8C8" w:sz="4"/>
-              <w:left w:val="single" w:color="C8C8C8" w:sz="4"/>
-              <w:bottom w:val="single" w:color="C8C8C8" w:sz="4"/>
-              <w:right w:val="single" w:color="C8C8C8" w:sz="4"/>
-            </w:tcBorders>
-            <w:shd w:fill="F3F6FA" w:color="auto" w:val="clear"/>
-            <w:tcMar>
-              <w:top w:type="dxa" w:w="80"/>
-              <w:left w:type="dxa" w:w="120"/>
-              <w:bottom w:type="dxa" w:w="80"/>
-              <w:right w:type="dxa" w:w="120"/>
-            </w:tcMar>
-          </w:tcPr>
-          <w:p>
-            <w:pPr>
-              <w:keepNext w:val="false"/>
-              <w:spacing w:line="264"/>
-              <w:jc w:val="left"/>
-            </w:pPr>
-            <w:r>
-              <w:rPr>
-                <w:rFonts w:ascii="Calibri" w:cs="Calibri" w:eastAsia="Calibri" w:hAnsi="Calibri"/>
-                <w:b w:val="false"/>
-                <w:bCs w:val="false"/>
-                <w:sz w:val="19"/>
-                <w:szCs w:val="19"/>
-              </w:rPr>
-              <w:t xml:space="preserve">Corregido: muestra las que están en ejecución y calcula el resumen parcial desde los totales horarios</w:t>
-            </w:r>
-          </w:p>
-        </w:tc>
-      </w:tr>
-      <w:tr>
-        <w:trPr>
-          <w:cantSplit/>
-        </w:trPr>
-        <w:tc>
-          <w:tcPr>
-            <w:tcW w:type="dxa" w:w="450"/>
-            <w:tcBorders>
-              <w:top w:val="single" w:color="C8C8C8" w:sz="4"/>
-              <w:left w:val="single" w:color="C8C8C8" w:sz="4"/>
-              <w:bottom w:val="single" w:color="C8C8C8" w:sz="4"/>
-              <w:right w:val="single" w:color="C8C8C8" w:sz="4"/>
-            </w:tcBorders>
-            <w:tcMar>
-              <w:top w:type="dxa" w:w="80"/>
-              <w:left w:type="dxa" w:w="120"/>
-              <w:bottom w:type="dxa" w:w="80"/>
-              <w:right w:type="dxa" w:w="120"/>
-            </w:tcMar>
-          </w:tcPr>
-          <w:p>
-            <w:pPr>
-              <w:keepNext w:val="false"/>
-              <w:spacing w:line="264"/>
-              <w:jc w:val="left"/>
-            </w:pPr>
-            <w:r>
-              <w:rPr>
-                <w:rFonts w:ascii="Calibri" w:cs="Calibri" w:eastAsia="Calibri" w:hAnsi="Calibri"/>
-                <w:b w:val="false"/>
-                <w:bCs w:val="false"/>
-                <w:sz w:val="19"/>
-                <w:szCs w:val="19"/>
-              </w:rPr>
-              <w:t xml:space="preserve">3</w:t>
-            </w:r>
-          </w:p>
-        </w:tc>
-        <w:tc>
-          <w:tcPr>
-            <w:tcW w:type="dxa" w:w="5188"/>
-            <w:tcBorders>
-              <w:top w:val="single" w:color="C8C8C8" w:sz="4"/>
-              <w:left w:val="single" w:color="C8C8C8" w:sz="4"/>
-              <w:bottom w:val="single" w:color="C8C8C8" w:sz="4"/>
-              <w:right w:val="single" w:color="C8C8C8" w:sz="4"/>
-            </w:tcBorders>
-            <w:tcMar>
-              <w:top w:type="dxa" w:w="80"/>
-              <w:left w:type="dxa" w:w="120"/>
-              <w:bottom w:type="dxa" w:w="80"/>
-              <w:right w:type="dxa" w:w="120"/>
-            </w:tcMar>
-          </w:tcPr>
-          <w:p>
-            <w:pPr>
-              <w:keepNext w:val="false"/>
-              <w:spacing w:line="264"/>
-              <w:jc w:val="left"/>
-            </w:pPr>
-            <w:r>
-              <w:rPr>
-                <w:rFonts w:ascii="Calibri" w:cs="Calibri" w:eastAsia="Calibri" w:hAnsi="Calibri"/>
-                <w:b w:val="false"/>
-                <w:bCs w:val="false"/>
-                <w:sz w:val="19"/>
-                <w:szCs w:val="19"/>
-              </w:rPr>
-              <w:t xml:space="preserve">La tabla de máquinas quedaba vacía: ningún script cargaba el catálogo en la base. Sin ella fallaban el selector, el top 10 y los análisis por criticidad.</w:t>
-            </w:r>
-          </w:p>
-        </w:tc>
-        <w:tc>
-          <w:tcPr>
-            <w:tcW w:type="dxa" w:w="4000"/>
-            <w:tcBorders>
-              <w:top w:val="single" w:color="C8C8C8" w:sz="4"/>
-              <w:left w:val="single" w:color="C8C8C8" w:sz="4"/>
-              <w:bottom w:val="single" w:color="C8C8C8" w:sz="4"/>
-              <w:right w:val="single" w:color="C8C8C8" w:sz="4"/>
-            </w:tcBorders>
-            <w:tcMar>
-              <w:top w:type="dxa" w:w="80"/>
-              <w:left w:type="dxa" w:w="120"/>
-              <w:bottom w:type="dxa" w:w="80"/>
-              <w:right w:type="dxa" w:w="120"/>
-            </w:tcMar>
-          </w:tcPr>
-          <w:p>
-            <w:pPr>
-              <w:keepNext w:val="false"/>
-              <w:spacing w:line="264"/>
-              <w:jc w:val="left"/>
-            </w:pPr>
-            <w:r>
-              <w:rPr>
-                <w:rFonts w:ascii="Calibri" w:cs="Calibri" w:eastAsia="Calibri" w:hAnsi="Calibri"/>
-                <w:b w:val="false"/>
-                <w:bCs w:val="false"/>
-                <w:sz w:val="19"/>
-                <w:szCs w:val="19"/>
-              </w:rPr>
-              <w:t xml:space="preserve">Corregido en MATLAB (ensureMachines); falta probarlo con MATLAB</w:t>
-            </w:r>
-          </w:p>
-        </w:tc>
-      </w:tr>
-      <w:tr>
-        <w:trPr>
-          <w:cantSplit/>
-        </w:trPr>
-        <w:tc>
-          <w:tcPr>
-            <w:tcW w:type="dxa" w:w="450"/>
-            <w:tcBorders>
-              <w:top w:val="single" w:color="C8C8C8" w:sz="4"/>
-              <w:left w:val="single" w:color="C8C8C8" w:sz="4"/>
-              <w:bottom w:val="single" w:color="C8C8C8" w:sz="4"/>
-              <w:right w:val="single" w:color="C8C8C8" w:sz="4"/>
-            </w:tcBorders>
-            <w:shd w:fill="F3F6FA" w:color="auto" w:val="clear"/>
-            <w:tcMar>
-              <w:top w:type="dxa" w:w="80"/>
-              <w:left w:type="dxa" w:w="120"/>
-              <w:bottom w:type="dxa" w:w="80"/>
-              <w:right w:type="dxa" w:w="120"/>
-            </w:tcMar>
-          </w:tcPr>
-          <w:p>
-            <w:pPr>
-              <w:keepNext w:val="false"/>
-              <w:spacing w:line="264"/>
-              <w:jc w:val="left"/>
-            </w:pPr>
-            <w:r>
-              <w:rPr>
-                <w:rFonts w:ascii="Calibri" w:cs="Calibri" w:eastAsia="Calibri" w:hAnsi="Calibri"/>
-                <w:b w:val="false"/>
-                <w:bCs w:val="false"/>
-                <w:sz w:val="19"/>
-                <w:szCs w:val="19"/>
-              </w:rPr>
-              <w:t xml:space="preserve">4</w:t>
-            </w:r>
-          </w:p>
-        </w:tc>
-        <w:tc>
-          <w:tcPr>
-            <w:tcW w:type="dxa" w:w="5188"/>
-            <w:tcBorders>
-              <w:top w:val="single" w:color="C8C8C8" w:sz="4"/>
-              <w:left w:val="single" w:color="C8C8C8" w:sz="4"/>
-              <w:bottom w:val="single" w:color="C8C8C8" w:sz="4"/>
-              <w:right w:val="single" w:color="C8C8C8" w:sz="4"/>
-            </w:tcBorders>
-            <w:shd w:fill="F3F6FA" w:color="auto" w:val="clear"/>
-            <w:tcMar>
-              <w:top w:type="dxa" w:w="80"/>
-              <w:left w:type="dxa" w:w="120"/>
-              <w:bottom w:type="dxa" w:w="80"/>
-              <w:right w:type="dxa" w:w="120"/>
-            </w:tcMar>
-          </w:tcPr>
-          <w:p>
-            <w:pPr>
-              <w:keepNext w:val="false"/>
-              <w:spacing w:line="264"/>
-              <w:jc w:val="left"/>
-            </w:pPr>
-            <w:r>
-              <w:rPr>
-                <w:rFonts w:ascii="Calibri" w:cs="Calibri" w:eastAsia="Calibri" w:hAnsi="Calibri"/>
-                <w:b w:val="false"/>
-                <w:bCs w:val="false"/>
-                <w:sz w:val="19"/>
-                <w:szCs w:val="19"/>
-              </w:rPr>
-              <w:t xml:space="preserve">Flask podía crear un archivo de base vacío antes de que MATLAB creara el esquema, y MATLAB no lo volvía a crear.</w:t>
-            </w:r>
-          </w:p>
-        </w:tc>
-        <w:tc>
-          <w:tcPr>
-            <w:tcW w:type="dxa" w:w="4000"/>
-            <w:tcBorders>
-              <w:top w:val="single" w:color="C8C8C8" w:sz="4"/>
-              <w:left w:val="single" w:color="C8C8C8" w:sz="4"/>
-              <w:bottom w:val="single" w:color="C8C8C8" w:sz="4"/>
-              <w:right w:val="single" w:color="C8C8C8" w:sz="4"/>
-            </w:tcBorders>
-            <w:shd w:fill="F3F6FA" w:color="auto" w:val="clear"/>
-            <w:tcMar>
-              <w:top w:type="dxa" w:w="80"/>
-              <w:left w:type="dxa" w:w="120"/>
-              <w:bottom w:type="dxa" w:w="80"/>
-              <w:right w:type="dxa" w:w="120"/>
-            </w:tcMar>
-          </w:tcPr>
-          <w:p>
-            <w:pPr>
-              <w:keepNext w:val="false"/>
-              <w:spacing w:line="264"/>
-              <w:jc w:val="left"/>
-            </w:pPr>
-            <w:r>
-              <w:rPr>
-                <w:rFonts w:ascii="Calibri" w:cs="Calibri" w:eastAsia="Calibri" w:hAnsi="Calibri"/>
-                <w:b w:val="false"/>
-                <w:bCs w:val="false"/>
-                <w:sz w:val="19"/>
-                <w:szCs w:val="19"/>
-              </w:rPr>
-              <w:t xml:space="preserve">Corregido: conexión de solo lectura y esquema creado por el orquestador</w:t>
-            </w:r>
-          </w:p>
-        </w:tc>
-      </w:tr>
-      <w:tr>
-        <w:trPr>
-          <w:cantSplit/>
-        </w:trPr>
-        <w:tc>
-          <w:tcPr>
-            <w:tcW w:type="dxa" w:w="450"/>
-            <w:tcBorders>
-              <w:top w:val="single" w:color="C8C8C8" w:sz="4"/>
-              <w:left w:val="single" w:color="C8C8C8" w:sz="4"/>
-              <w:bottom w:val="single" w:color="C8C8C8" w:sz="4"/>
-              <w:right w:val="single" w:color="C8C8C8" w:sz="4"/>
-            </w:tcBorders>
-            <w:tcMar>
-              <w:top w:type="dxa" w:w="80"/>
-              <w:left w:type="dxa" w:w="120"/>
-              <w:bottom w:type="dxa" w:w="80"/>
-              <w:right w:type="dxa" w:w="120"/>
-            </w:tcMar>
-          </w:tcPr>
-          <w:p>
-            <w:pPr>
-              <w:keepNext w:val="false"/>
-              <w:spacing w:line="264"/>
-              <w:jc w:val="left"/>
-            </w:pPr>
-            <w:r>
-              <w:rPr>
-                <w:rFonts w:ascii="Calibri" w:cs="Calibri" w:eastAsia="Calibri" w:hAnsi="Calibri"/>
-                <w:b w:val="false"/>
-                <w:bCs w:val="false"/>
-                <w:sz w:val="19"/>
-                <w:szCs w:val="19"/>
-              </w:rPr>
-              <w:t xml:space="preserve">5</w:t>
-            </w:r>
-          </w:p>
-        </w:tc>
-        <w:tc>
-          <w:tcPr>
-            <w:tcW w:type="dxa" w:w="5188"/>
-            <w:tcBorders>
-              <w:top w:val="single" w:color="C8C8C8" w:sz="4"/>
-              <w:left w:val="single" w:color="C8C8C8" w:sz="4"/>
-              <w:bottom w:val="single" w:color="C8C8C8" w:sz="4"/>
-              <w:right w:val="single" w:color="C8C8C8" w:sz="4"/>
-            </w:tcBorders>
-            <w:tcMar>
-              <w:top w:type="dxa" w:w="80"/>
-              <w:left w:type="dxa" w:w="120"/>
-              <w:bottom w:type="dxa" w:w="80"/>
-              <w:right w:type="dxa" w:w="120"/>
-            </w:tcMar>
-          </w:tcPr>
-          <w:p>
-            <w:pPr>
-              <w:keepNext w:val="false"/>
-              <w:spacing w:line="264"/>
-              <w:jc w:val="left"/>
-            </w:pPr>
-            <w:r>
-              <w:rPr>
-                <w:rFonts w:ascii="Calibri" w:cs="Calibri" w:eastAsia="Calibri" w:hAnsi="Calibri"/>
-                <w:b w:val="false"/>
-                <w:bCs w:val="false"/>
-                <w:sz w:val="19"/>
-                <w:szCs w:val="19"/>
-              </w:rPr>
-              <w:t xml:space="preserve">El orquestador fallaba si MATLAB no estaba en el PATH (la ruta por defecto tenía un error de tipo), dependía de python-dotenv, ignoraba --interval, podía bloquearse por salidas sin leer y cerraba el servidor cuando MATLAB terminaba.</w:t>
-            </w:r>
-          </w:p>
-        </w:tc>
-        <w:tc>
-          <w:tcPr>
-            <w:tcW w:type="dxa" w:w="4000"/>
-            <w:tcBorders>
-              <w:top w:val="single" w:color="C8C8C8" w:sz="4"/>
-              <w:left w:val="single" w:color="C8C8C8" w:sz="4"/>
-              <w:bottom w:val="single" w:color="C8C8C8" w:sz="4"/>
-              <w:right w:val="single" w:color="C8C8C8" w:sz="4"/>
-            </w:tcBorders>
-            <w:tcMar>
-              <w:top w:type="dxa" w:w="80"/>
-              <w:left w:type="dxa" w:w="120"/>
-              <w:bottom w:type="dxa" w:w="80"/>
-              <w:right w:type="dxa" w:w="120"/>
-            </w:tcMar>
-          </w:tcPr>
-          <w:p>
-            <w:pPr>
-              <w:keepNext w:val="false"/>
-              <w:spacing w:line="264"/>
-              <w:jc w:val="left"/>
-            </w:pPr>
-            <w:r>
-              <w:rPr>
-                <w:rFonts w:ascii="Calibri" w:cs="Calibri" w:eastAsia="Calibri" w:hAnsi="Calibri"/>
-                <w:b w:val="false"/>
-                <w:bCs w:val="false"/>
-                <w:sz w:val="19"/>
-                <w:szCs w:val="19"/>
-              </w:rPr>
-              <w:t xml:space="preserve">Corregido</w:t>
-            </w:r>
-          </w:p>
-        </w:tc>
-      </w:tr>
-      <w:tr>
-        <w:trPr>
-          <w:cantSplit/>
-        </w:trPr>
-        <w:tc>
-          <w:tcPr>
-            <w:tcW w:type="dxa" w:w="450"/>
-            <w:tcBorders>
-              <w:top w:val="single" w:color="C8C8C8" w:sz="4"/>
-              <w:left w:val="single" w:color="C8C8C8" w:sz="4"/>
-              <w:bottom w:val="single" w:color="C8C8C8" w:sz="4"/>
-              <w:right w:val="single" w:color="C8C8C8" w:sz="4"/>
-            </w:tcBorders>
-            <w:shd w:fill="F3F6FA" w:color="auto" w:val="clear"/>
-            <w:tcMar>
-              <w:top w:type="dxa" w:w="80"/>
-              <w:left w:type="dxa" w:w="120"/>
-              <w:bottom w:type="dxa" w:w="80"/>
-              <w:right w:type="dxa" w:w="120"/>
-            </w:tcMar>
-          </w:tcPr>
-          <w:p>
-            <w:pPr>
-              <w:keepNext w:val="false"/>
-              <w:spacing w:line="264"/>
-              <w:jc w:val="left"/>
-            </w:pPr>
-            <w:r>
-              <w:rPr>
-                <w:rFonts w:ascii="Calibri" w:cs="Calibri" w:eastAsia="Calibri" w:hAnsi="Calibri"/>
-                <w:b w:val="false"/>
-                <w:bCs w:val="false"/>
-                <w:sz w:val="19"/>
-                <w:szCs w:val="19"/>
-              </w:rPr>
-              <w:t xml:space="preserve">6</w:t>
-            </w:r>
-          </w:p>
-        </w:tc>
-        <w:tc>
-          <w:tcPr>
-            <w:tcW w:type="dxa" w:w="5188"/>
-            <w:tcBorders>
-              <w:top w:val="single" w:color="C8C8C8" w:sz="4"/>
-              <w:left w:val="single" w:color="C8C8C8" w:sz="4"/>
-              <w:bottom w:val="single" w:color="C8C8C8" w:sz="4"/>
-              <w:right w:val="single" w:color="C8C8C8" w:sz="4"/>
-            </w:tcBorders>
-            <w:shd w:fill="F3F6FA" w:color="auto" w:val="clear"/>
-            <w:tcMar>
-              <w:top w:type="dxa" w:w="80"/>
-              <w:left w:type="dxa" w:w="120"/>
-              <w:bottom w:type="dxa" w:w="80"/>
-              <w:right w:type="dxa" w:w="120"/>
-            </w:tcMar>
-          </w:tcPr>
-          <w:p>
-            <w:pPr>
-              <w:keepNext w:val="false"/>
-              <w:spacing w:line="264"/>
-              <w:jc w:val="left"/>
-            </w:pPr>
-            <w:r>
-              <w:rPr>
-                <w:rFonts w:ascii="Calibri" w:cs="Calibri" w:eastAsia="Calibri" w:hAnsi="Calibri"/>
-                <w:b w:val="false"/>
-                <w:bCs w:val="false"/>
-                <w:sz w:val="19"/>
-                <w:szCs w:val="19"/>
-              </w:rPr>
-              <w:t xml:space="preserve">El archivo .env con la ruta personal de MATLAB de un integrante estaba versionado, y Flask no figuraba en requirements.txt.</w:t>
-            </w:r>
-          </w:p>
-        </w:tc>
-        <w:tc>
-          <w:tcPr>
-            <w:tcW w:type="dxa" w:w="4000"/>
-            <w:tcBorders>
-              <w:top w:val="single" w:color="C8C8C8" w:sz="4"/>
-              <w:left w:val="single" w:color="C8C8C8" w:sz="4"/>
-              <w:bottom w:val="single" w:color="C8C8C8" w:sz="4"/>
-              <w:right w:val="single" w:color="C8C8C8" w:sz="4"/>
-            </w:tcBorders>
-            <w:shd w:fill="F3F6FA" w:color="auto" w:val="clear"/>
-            <w:tcMar>
-              <w:top w:type="dxa" w:w="80"/>
-              <w:left w:type="dxa" w:w="120"/>
-              <w:bottom w:type="dxa" w:w="80"/>
-              <w:right w:type="dxa" w:w="120"/>
-            </w:tcMar>
-          </w:tcPr>
-          <w:p>
-            <w:pPr>
-              <w:keepNext w:val="false"/>
-              <w:spacing w:line="264"/>
-              <w:jc w:val="left"/>
-            </w:pPr>
-            <w:r>
-              <w:rPr>
-                <w:rFonts w:ascii="Calibri" w:cs="Calibri" w:eastAsia="Calibri" w:hAnsi="Calibri"/>
-                <w:b w:val="false"/>
-                <w:bCs w:val="false"/>
-                <w:sz w:val="19"/>
-                <w:szCs w:val="19"/>
-              </w:rPr>
-              <w:t xml:space="preserve">Corregido: .env fuera del repositorio y dependencias completas</w:t>
-            </w:r>
-          </w:p>
-        </w:tc>
-      </w:tr>
-      <w:tr>
-        <w:trPr>
-          <w:cantSplit/>
-        </w:trPr>
-        <w:tc>
-          <w:tcPr>
-            <w:tcW w:type="dxa" w:w="450"/>
-            <w:tcBorders>
-              <w:top w:val="single" w:color="C8C8C8" w:sz="4"/>
-              <w:left w:val="single" w:color="C8C8C8" w:sz="4"/>
-              <w:bottom w:val="single" w:color="C8C8C8" w:sz="4"/>
-              <w:right w:val="single" w:color="C8C8C8" w:sz="4"/>
-            </w:tcBorders>
-            <w:tcMar>
-              <w:top w:type="dxa" w:w="80"/>
-              <w:left w:type="dxa" w:w="120"/>
-              <w:bottom w:type="dxa" w:w="80"/>
-              <w:right w:type="dxa" w:w="120"/>
-            </w:tcMar>
-          </w:tcPr>
-          <w:p>
-            <w:pPr>
-              <w:keepNext w:val="false"/>
-              <w:spacing w:line="264"/>
-              <w:jc w:val="left"/>
-            </w:pPr>
-            <w:r>
-              <w:rPr>
-                <w:rFonts w:ascii="Calibri" w:cs="Calibri" w:eastAsia="Calibri" w:hAnsi="Calibri"/>
-                <w:b w:val="false"/>
-                <w:bCs w:val="false"/>
-                <w:sz w:val="19"/>
-                <w:szCs w:val="19"/>
-              </w:rPr>
-              <w:t xml:space="preserve">7</w:t>
-            </w:r>
-          </w:p>
-        </w:tc>
-        <w:tc>
-          <w:tcPr>
-            <w:tcW w:type="dxa" w:w="5188"/>
-            <w:tcBorders>
-              <w:top w:val="single" w:color="C8C8C8" w:sz="4"/>
-              <w:left w:val="single" w:color="C8C8C8" w:sz="4"/>
-              <w:bottom w:val="single" w:color="C8C8C8" w:sz="4"/>
-              <w:right w:val="single" w:color="C8C8C8" w:sz="4"/>
-            </w:tcBorders>
-            <w:tcMar>
-              <w:top w:type="dxa" w:w="80"/>
-              <w:left w:type="dxa" w:w="120"/>
-              <w:bottom w:type="dxa" w:w="80"/>
-              <w:right w:type="dxa" w:w="120"/>
-            </w:tcMar>
-          </w:tcPr>
-          <w:p>
-            <w:pPr>
-              <w:keepNext w:val="false"/>
-              <w:spacing w:line="264"/>
-              <w:jc w:val="left"/>
-            </w:pPr>
-            <w:r>
-              <w:rPr>
-                <w:rFonts w:ascii="Calibri" w:cs="Calibri" w:eastAsia="Calibri" w:hAnsi="Calibri"/>
-                <w:b w:val="false"/>
-                <w:bCs w:val="false"/>
-                <w:sz w:val="19"/>
-                <w:szCs w:val="19"/>
-              </w:rPr>
-              <w:t xml:space="preserve">El gráfico del top 10 leía campos distintos de los que guarda MATLAB.</w:t>
-            </w:r>
-          </w:p>
-        </w:tc>
-        <w:tc>
-          <w:tcPr>
-            <w:tcW w:type="dxa" w:w="4000"/>
-            <w:tcBorders>
-              <w:top w:val="single" w:color="C8C8C8" w:sz="4"/>
-              <w:left w:val="single" w:color="C8C8C8" w:sz="4"/>
-              <w:bottom w:val="single" w:color="C8C8C8" w:sz="4"/>
-              <w:right w:val="single" w:color="C8C8C8" w:sz="4"/>
-            </w:tcBorders>
-            <w:tcMar>
-              <w:top w:type="dxa" w:w="80"/>
-              <w:left w:type="dxa" w:w="120"/>
-              <w:bottom w:type="dxa" w:w="80"/>
-              <w:right w:type="dxa" w:w="120"/>
-            </w:tcMar>
-          </w:tcPr>
-          <w:p>
-            <w:pPr>
-              <w:keepNext w:val="false"/>
-              <w:spacing w:line="264"/>
-              <w:jc w:val="left"/>
-            </w:pPr>
-            <w:r>
-              <w:rPr>
-                <w:rFonts w:ascii="Calibri" w:cs="Calibri" w:eastAsia="Calibri" w:hAnsi="Calibri"/>
-                <w:b w:val="false"/>
-                <w:bCs w:val="false"/>
-                <w:sz w:val="19"/>
-                <w:szCs w:val="19"/>
-              </w:rPr>
-              <w:t xml:space="preserve">Corregido: acepta ambos formatos</w:t>
-            </w:r>
-          </w:p>
-        </w:tc>
-      </w:tr>
-      <w:tr>
-        <w:trPr>
-          <w:cantSplit/>
-        </w:trPr>
-        <w:tc>
-          <w:tcPr>
-            <w:tcW w:type="dxa" w:w="450"/>
-            <w:tcBorders>
-              <w:top w:val="single" w:color="C8C8C8" w:sz="4"/>
-              <w:left w:val="single" w:color="C8C8C8" w:sz="4"/>
-              <w:bottom w:val="single" w:color="C8C8C8" w:sz="4"/>
-              <w:right w:val="single" w:color="C8C8C8" w:sz="4"/>
-            </w:tcBorders>
-            <w:shd w:fill="F3F6FA" w:color="auto" w:val="clear"/>
-            <w:tcMar>
-              <w:top w:type="dxa" w:w="80"/>
-              <w:left w:type="dxa" w:w="120"/>
-              <w:bottom w:type="dxa" w:w="80"/>
-              <w:right w:type="dxa" w:w="120"/>
-            </w:tcMar>
-          </w:tcPr>
-          <w:p>
-            <w:pPr>
-              <w:keepNext w:val="false"/>
-              <w:spacing w:line="264"/>
-              <w:jc w:val="left"/>
-            </w:pPr>
-            <w:r>
-              <w:rPr>
-                <w:rFonts w:ascii="Calibri" w:cs="Calibri" w:eastAsia="Calibri" w:hAnsi="Calibri"/>
-                <w:b w:val="false"/>
-                <w:bCs w:val="false"/>
-                <w:sz w:val="19"/>
-                <w:szCs w:val="19"/>
-              </w:rPr>
-              <w:t xml:space="preserve">8</w:t>
-            </w:r>
-          </w:p>
-        </w:tc>
-        <w:tc>
-          <w:tcPr>
-            <w:tcW w:type="dxa" w:w="5188"/>
-            <w:tcBorders>
-              <w:top w:val="single" w:color="C8C8C8" w:sz="4"/>
-              <w:left w:val="single" w:color="C8C8C8" w:sz="4"/>
-              <w:bottom w:val="single" w:color="C8C8C8" w:sz="4"/>
-              <w:right w:val="single" w:color="C8C8C8" w:sz="4"/>
-            </w:tcBorders>
-            <w:shd w:fill="F3F6FA" w:color="auto" w:val="clear"/>
-            <w:tcMar>
-              <w:top w:type="dxa" w:w="80"/>
-              <w:left w:type="dxa" w:w="120"/>
-              <w:bottom w:type="dxa" w:w="80"/>
-              <w:right w:type="dxa" w:w="120"/>
-            </w:tcMar>
-          </w:tcPr>
-          <w:p>
-            <w:pPr>
-              <w:keepNext w:val="false"/>
-              <w:spacing w:line="264"/>
-              <w:jc w:val="left"/>
-            </w:pPr>
-            <w:r>
-              <w:rPr>
-                <w:rFonts w:ascii="Calibri" w:cs="Calibri" w:eastAsia="Calibri" w:hAnsi="Calibri"/>
-                <w:b w:val="false"/>
-                <w:bCs w:val="false"/>
-                <w:sz w:val="19"/>
-                <w:szCs w:val="19"/>
-              </w:rPr>
-              <w:t xml:space="preserve">Dos pruebas fallaban en Windows (codificación de texto y mensaje de load_catalog).</w:t>
-            </w:r>
-          </w:p>
-        </w:tc>
-        <w:tc>
-          <w:tcPr>
-            <w:tcW w:type="dxa" w:w="4000"/>
-            <w:tcBorders>
-              <w:top w:val="single" w:color="C8C8C8" w:sz="4"/>
-              <w:left w:val="single" w:color="C8C8C8" w:sz="4"/>
-              <w:bottom w:val="single" w:color="C8C8C8" w:sz="4"/>
-              <w:right w:val="single" w:color="C8C8C8" w:sz="4"/>
-            </w:tcBorders>
-            <w:shd w:fill="F3F6FA" w:color="auto" w:val="clear"/>
-            <w:tcMar>
-              <w:top w:type="dxa" w:w="80"/>
-              <w:left w:type="dxa" w:w="120"/>
-              <w:bottom w:type="dxa" w:w="80"/>
-              <w:right w:type="dxa" w:w="120"/>
-            </w:tcMar>
-          </w:tcPr>
-          <w:p>
-            <w:pPr>
-              <w:keepNext w:val="false"/>
-              <w:spacing w:line="264"/>
-              <w:jc w:val="left"/>
-            </w:pPr>
-            <w:r>
-              <w:rPr>
-                <w:rFonts w:ascii="Calibri" w:cs="Calibri" w:eastAsia="Calibri" w:hAnsi="Calibri"/>
-                <w:b w:val="false"/>
-                <w:bCs w:val="false"/>
-                <w:sz w:val="19"/>
-                <w:szCs w:val="19"/>
-              </w:rPr>
-              <w:t xml:space="preserve">Corregido</w:t>
-            </w:r>
-          </w:p>
-        </w:tc>
-      </w:tr>
-      <w:tr>
-        <w:trPr>
-          <w:cantSplit/>
-        </w:trPr>
-        <w:tc>
-          <w:tcPr>
-            <w:tcW w:type="dxa" w:w="450"/>
-            <w:tcBorders>
-              <w:top w:val="single" w:color="C8C8C8" w:sz="4"/>
-              <w:left w:val="single" w:color="C8C8C8" w:sz="4"/>
-              <w:bottom w:val="single" w:color="C8C8C8" w:sz="4"/>
-              <w:right w:val="single" w:color="C8C8C8" w:sz="4"/>
-            </w:tcBorders>
-            <w:tcMar>
-              <w:top w:type="dxa" w:w="80"/>
-              <w:left w:type="dxa" w:w="120"/>
-              <w:bottom w:type="dxa" w:w="80"/>
-              <w:right w:type="dxa" w:w="120"/>
-            </w:tcMar>
-          </w:tcPr>
-          <w:p>
-            <w:pPr>
-              <w:keepNext w:val="false"/>
-              <w:spacing w:line="264"/>
-              <w:jc w:val="left"/>
-            </w:pPr>
-            <w:r>
-              <w:rPr>
-                <w:rFonts w:ascii="Calibri" w:cs="Calibri" w:eastAsia="Calibri" w:hAnsi="Calibri"/>
-                <w:b w:val="false"/>
-                <w:bCs w:val="false"/>
-                <w:sz w:val="19"/>
-                <w:szCs w:val="19"/>
-              </w:rPr>
-              <w:t xml:space="preserve">9</w:t>
-            </w:r>
-          </w:p>
-        </w:tc>
-        <w:tc>
-          <w:tcPr>
-            <w:tcW w:type="dxa" w:w="5188"/>
-            <w:tcBorders>
-              <w:top w:val="single" w:color="C8C8C8" w:sz="4"/>
-              <w:left w:val="single" w:color="C8C8C8" w:sz="4"/>
-              <w:bottom w:val="single" w:color="C8C8C8" w:sz="4"/>
-              <w:right w:val="single" w:color="C8C8C8" w:sz="4"/>
-            </w:tcBorders>
-            <w:tcMar>
-              <w:top w:type="dxa" w:w="80"/>
-              <w:left w:type="dxa" w:w="120"/>
-              <w:bottom w:type="dxa" w:w="80"/>
-              <w:right w:type="dxa" w:w="120"/>
-            </w:tcMar>
-          </w:tcPr>
-          <w:p>
-            <w:pPr>
-              <w:keepNext w:val="false"/>
-              <w:spacing w:line="264"/>
-              <w:jc w:val="left"/>
-            </w:pPr>
-            <w:r>
-              <w:rPr>
-                <w:rFonts w:ascii="Calibri" w:cs="Calibri" w:eastAsia="Calibri" w:hAnsi="Calibri"/>
-                <w:b w:val="false"/>
-                <w:bCs w:val="false"/>
-                <w:sz w:val="19"/>
-                <w:szCs w:val="19"/>
-              </w:rPr>
-              <w:t xml:space="preserve">El selector de máquina y las fechas del dashboard no filtran los gráficos; solo afectan la exportación.</w:t>
-            </w:r>
-          </w:p>
-        </w:tc>
-        <w:tc>
-          <w:tcPr>
-            <w:tcW w:type="dxa" w:w="4000"/>
-            <w:tcBorders>
-              <w:top w:val="single" w:color="C8C8C8" w:sz="4"/>
-              <w:left w:val="single" w:color="C8C8C8" w:sz="4"/>
-              <w:bottom w:val="single" w:color="C8C8C8" w:sz="4"/>
-              <w:right w:val="single" w:color="C8C8C8" w:sz="4"/>
-            </w:tcBorders>
-            <w:tcMar>
-              <w:top w:type="dxa" w:w="80"/>
-              <w:left w:type="dxa" w:w="120"/>
-              <w:bottom w:type="dxa" w:w="80"/>
-              <w:right w:type="dxa" w:w="120"/>
-            </w:tcMar>
-          </w:tcPr>
-          <w:p>
-            <w:pPr>
-              <w:keepNext w:val="false"/>
-              <w:spacing w:line="264"/>
-              <w:jc w:val="left"/>
-            </w:pPr>
-            <w:r>
-              <w:rPr>
-                <w:rFonts w:ascii="Calibri" w:cs="Calibri" w:eastAsia="Calibri" w:hAnsi="Calibri"/>
-                <w:b w:val="false"/>
-                <w:bCs w:val="false"/>
-                <w:sz w:val="19"/>
-                <w:szCs w:val="19"/>
-              </w:rPr>
-              <w:t xml:space="preserve">Pendiente</w:t>
-            </w:r>
-          </w:p>
-        </w:tc>
-      </w:tr>
-      <w:tr>
-        <w:trPr>
-          <w:cantSplit/>
-        </w:trPr>
-        <w:tc>
-          <w:tcPr>
-            <w:tcW w:type="dxa" w:w="450"/>
-            <w:tcBorders>
-              <w:top w:val="single" w:color="C8C8C8" w:sz="4"/>
-              <w:left w:val="single" w:color="C8C8C8" w:sz="4"/>
-              <w:bottom w:val="single" w:color="C8C8C8" w:sz="4"/>
-              <w:right w:val="single" w:color="C8C8C8" w:sz="4"/>
-            </w:tcBorders>
-            <w:shd w:fill="F3F6FA" w:color="auto" w:val="clear"/>
-            <w:tcMar>
-              <w:top w:type="dxa" w:w="80"/>
-              <w:left w:type="dxa" w:w="120"/>
-              <w:bottom w:type="dxa" w:w="80"/>
-              <w:right w:type="dxa" w:w="120"/>
-            </w:tcMar>
-          </w:tcPr>
-          <w:p>
-            <w:pPr>
-              <w:keepNext w:val="false"/>
-              <w:spacing w:line="264"/>
-              <w:jc w:val="left"/>
-            </w:pPr>
-            <w:r>
-              <w:rPr>
-                <w:rFonts w:ascii="Calibri" w:cs="Calibri" w:eastAsia="Calibri" w:hAnsi="Calibri"/>
-                <w:b w:val="false"/>
-                <w:bCs w:val="false"/>
-                <w:sz w:val="19"/>
-                <w:szCs w:val="19"/>
-              </w:rPr>
-              <w:t xml:space="preserve">10</w:t>
-            </w:r>
-          </w:p>
-        </w:tc>
-        <w:tc>
-          <w:tcPr>
-            <w:tcW w:type="dxa" w:w="5188"/>
-            <w:tcBorders>
-              <w:top w:val="single" w:color="C8C8C8" w:sz="4"/>
-              <w:left w:val="single" w:color="C8C8C8" w:sz="4"/>
-              <w:bottom w:val="single" w:color="C8C8C8" w:sz="4"/>
-              <w:right w:val="single" w:color="C8C8C8" w:sz="4"/>
-            </w:tcBorders>
-            <w:shd w:fill="F3F6FA" w:color="auto" w:val="clear"/>
-            <w:tcMar>
-              <w:top w:type="dxa" w:w="80"/>
-              <w:left w:type="dxa" w:w="120"/>
-              <w:bottom w:type="dxa" w:w="80"/>
-              <w:right w:type="dxa" w:w="120"/>
-            </w:tcMar>
-          </w:tcPr>
-          <w:p>
-            <w:pPr>
-              <w:keepNext w:val="false"/>
-              <w:spacing w:line="264"/>
-              <w:jc w:val="left"/>
-            </w:pPr>
-            <w:r>
-              <w:rPr>
-                <w:rFonts w:ascii="Calibri" w:cs="Calibri" w:eastAsia="Calibri" w:hAnsi="Calibri"/>
-                <w:b w:val="false"/>
-                <w:bCs w:val="false"/>
-                <w:sz w:val="19"/>
-                <w:szCs w:val="19"/>
-              </w:rPr>
-              <w:t xml:space="preserve">El catálogo es un solo archivo de texto; agregar un equipo implica editarlo. No hay una carpeta por máquina como se planteó.</w:t>
-            </w:r>
-          </w:p>
-        </w:tc>
-        <w:tc>
-          <w:tcPr>
-            <w:tcW w:type="dxa" w:w="4000"/>
-            <w:tcBorders>
-              <w:top w:val="single" w:color="C8C8C8" w:sz="4"/>
-              <w:left w:val="single" w:color="C8C8C8" w:sz="4"/>
-              <w:bottom w:val="single" w:color="C8C8C8" w:sz="4"/>
-              <w:right w:val="single" w:color="C8C8C8" w:sz="4"/>
-            </w:tcBorders>
-            <w:shd w:fill="F3F6FA" w:color="auto" w:val="clear"/>
-            <w:tcMar>
-              <w:top w:type="dxa" w:w="80"/>
-              <w:left w:type="dxa" w:w="120"/>
-              <w:bottom w:type="dxa" w:w="80"/>
-              <w:right w:type="dxa" w:w="120"/>
-            </w:tcMar>
-          </w:tcPr>
-          <w:p>
-            <w:pPr>
-              <w:keepNext w:val="false"/>
-              <w:spacing w:line="264"/>
-              <w:jc w:val="left"/>
-            </w:pPr>
-            <w:r>
-              <w:rPr>
-                <w:rFonts w:ascii="Calibri" w:cs="Calibri" w:eastAsia="Calibri" w:hAnsi="Calibri"/>
-                <w:b w:val="false"/>
-                <w:bCs w:val="false"/>
-                <w:sz w:val="19"/>
-                <w:szCs w:val="19"/>
-              </w:rPr>
-              <w:t xml:space="preserve">Pendiente, según el diseño que se defina</w:t>
-            </w:r>
-          </w:p>
-        </w:tc>
-      </w:tr>
-      <w:tr>
-        <w:trPr>
-          <w:cantSplit/>
-        </w:trPr>
-        <w:tc>
-          <w:tcPr>
-            <w:tcW w:type="dxa" w:w="450"/>
-            <w:tcBorders>
-              <w:top w:val="single" w:color="C8C8C8" w:sz="4"/>
-              <w:left w:val="single" w:color="C8C8C8" w:sz="4"/>
-              <w:bottom w:val="single" w:color="C8C8C8" w:sz="4"/>
-              <w:right w:val="single" w:color="C8C8C8" w:sz="4"/>
-            </w:tcBorders>
-            <w:tcMar>
-              <w:top w:type="dxa" w:w="80"/>
-              <w:left w:type="dxa" w:w="120"/>
-              <w:bottom w:type="dxa" w:w="80"/>
-              <w:right w:type="dxa" w:w="120"/>
-            </w:tcMar>
-          </w:tcPr>
-          <w:p>
-            <w:pPr>
-              <w:keepNext w:val="false"/>
-              <w:spacing w:line="264"/>
-              <w:jc w:val="left"/>
-            </w:pPr>
-            <w:r>
-              <w:rPr>
-                <w:rFonts w:ascii="Calibri" w:cs="Calibri" w:eastAsia="Calibri" w:hAnsi="Calibri"/>
-                <w:b w:val="false"/>
-                <w:bCs w:val="false"/>
-                <w:sz w:val="19"/>
-                <w:szCs w:val="19"/>
-              </w:rPr>
-              <w:t xml:space="preserve">11</w:t>
-            </w:r>
-          </w:p>
-        </w:tc>
-        <w:tc>
-          <w:tcPr>
-            <w:tcW w:type="dxa" w:w="5188"/>
-            <w:tcBorders>
-              <w:top w:val="single" w:color="C8C8C8" w:sz="4"/>
-              <w:left w:val="single" w:color="C8C8C8" w:sz="4"/>
-              <w:bottom w:val="single" w:color="C8C8C8" w:sz="4"/>
-              <w:right w:val="single" w:color="C8C8C8" w:sz="4"/>
-            </w:tcBorders>
-            <w:tcMar>
-              <w:top w:type="dxa" w:w="80"/>
-              <w:left w:type="dxa" w:w="120"/>
-              <w:bottom w:type="dxa" w:w="80"/>
-              <w:right w:type="dxa" w:w="120"/>
-            </w:tcMar>
-          </w:tcPr>
-          <w:p>
-            <w:pPr>
-              <w:keepNext w:val="false"/>
-              <w:spacing w:line="264"/>
-              <w:jc w:val="left"/>
-            </w:pPr>
-            <w:r>
-              <w:rPr>
-                <w:rFonts w:ascii="Calibri" w:cs="Calibri" w:eastAsia="Calibri" w:hAnsi="Calibri"/>
-                <w:b w:val="false"/>
-                <w:bCs w:val="false"/>
-                <w:sz w:val="19"/>
-                <w:szCs w:val="19"/>
-              </w:rPr>
-              <w:t xml:space="preserve">No se ejecutó MATLAB en esta revisión: los cambios en sim_db, sim_engine y run_continuous no se probaron.</w:t>
-            </w:r>
-          </w:p>
-        </w:tc>
-        <w:tc>
-          <w:tcPr>
-            <w:tcW w:type="dxa" w:w="4000"/>
-            <w:tcBorders>
-              <w:top w:val="single" w:color="C8C8C8" w:sz="4"/>
-              <w:left w:val="single" w:color="C8C8C8" w:sz="4"/>
-              <w:bottom w:val="single" w:color="C8C8C8" w:sz="4"/>
-              <w:right w:val="single" w:color="C8C8C8" w:sz="4"/>
-            </w:tcBorders>
-            <w:tcMar>
-              <w:top w:type="dxa" w:w="80"/>
-              <w:left w:type="dxa" w:w="120"/>
-              <w:bottom w:type="dxa" w:w="80"/>
-              <w:right w:type="dxa" w:w="120"/>
-            </w:tcMar>
-          </w:tcPr>
-          <w:p>
-            <w:pPr>
-              <w:keepNext w:val="false"/>
-              <w:spacing w:line="264"/>
-              <w:jc w:val="left"/>
-            </w:pPr>
-            <w:r>
-              <w:rPr>
-                <w:rFonts w:ascii="Calibri" w:cs="Calibri" w:eastAsia="Calibri" w:hAnsi="Calibri"/>
-                <w:b w:val="false"/>
-                <w:bCs w:val="false"/>
-                <w:sz w:val="19"/>
-                <w:szCs w:val="19"/>
-              </w:rPr>
-              <w:t xml:space="preserve">Pendiente: correr runtests y una simulación</w:t>
-            </w:r>
-          </w:p>
-        </w:tc>
-      </w:tr>
-    </w:tbl>
-    <w:p>
-      <w:pPr>
-        <w:spacing w:after="80"/>
-      </w:pPr>
-    </w:p>
-    <w:p>
-      <w:pPr>
-        <w:pStyle w:val="Heading1"/>
-        <w:keepNext/>
-        <w:pageBreakBefore/>
-        <w:spacing w:after="120" w:before="300"/>
-      </w:pPr>
-      <w:r>
-        <w:rPr>
-          <w:rFonts w:ascii="Calibri" w:cs="Calibri" w:eastAsia="Calibri" w:hAnsi="Calibri"/>
-          <w:b/>
-          <w:bCs/>
-          <w:color w:val="1F4E79"/>
-          <w:sz w:val="28"/>
-          <w:szCs w:val="28"/>
-        </w:rPr>
-        <w:t xml:space="preserve">9. Pendientes</w:t>
-      </w:r>
-    </w:p>
-    <w:p>
-      <w:pPr>
-        <w:pStyle w:val="ListParagraph"/>
-        <w:numPr>
-          <w:ilvl w:val="0"/>
-          <w:numId w:val="2"/>
-        </w:numPr>
-        <w:spacing w:after="80" w:line="285"/>
-      </w:pPr>
-      <w:r>
-        <w:rPr>
-          <w:rFonts w:ascii="Calibri" w:cs="Calibri" w:eastAsia="Calibri" w:hAnsi="Calibri"/>
-          <w:sz w:val="21"/>
-          <w:szCs w:val="21"/>
-        </w:rPr>
-        <w:t xml:space="preserve">Ejecutar en una máquina con MATLAB las pruebas del simulador y una corrida completa, y revisar los totales anuales contra la estimación del catálogo.</w:t>
-      </w:r>
-    </w:p>
-    <w:p>
-      <w:pPr>
-        <w:pStyle w:val="ListParagraph"/>
-        <w:numPr>
-          <w:ilvl w:val="0"/>
-          <w:numId w:val="2"/>
-        </w:numPr>
-        <w:spacing w:after="80" w:line="285"/>
-      </w:pPr>
-      <w:r>
-        <w:rPr>
-          <w:rFonts w:ascii="Calibri" w:cs="Calibri" w:eastAsia="Calibri" w:hAnsi="Calibri"/>
-          <w:sz w:val="21"/>
-          <w:szCs w:val="21"/>
-        </w:rPr>
-        <w:t xml:space="preserve">Contrastar los datos de los 110 equipos con fichas técnicas de fabricantes.</w:t>
-      </w:r>
-    </w:p>
-    <w:p>
-      <w:pPr>
-        <w:pStyle w:val="ListParagraph"/>
-        <w:numPr>
-          <w:ilvl w:val="0"/>
-          <w:numId w:val="2"/>
-        </w:numPr>
-        <w:spacing w:after="80" w:line="285"/>
-      </w:pPr>
-      <w:r>
-        <w:rPr>
-          <w:rFonts w:ascii="Calibri" w:cs="Calibri" w:eastAsia="Calibri" w:hAnsi="Calibri"/>
-          <w:sz w:val="21"/>
-          <w:szCs w:val="21"/>
-        </w:rPr>
-        <w:t xml:space="preserve">Programar los escenarios de la sección 7 (por ejemplo, un equipo estándar contra uno de alta eficiencia, o con y sin variador) y mostrarlos en el dashboard, que es el objetivo central del nuevo enfoque. Falta además una referencia que respalde los ahorros esperados.</w:t>
-      </w:r>
-    </w:p>
-    <w:p>
-      <w:pPr>
-        <w:pStyle w:val="ListParagraph"/>
-        <w:numPr>
-          <w:ilvl w:val="0"/>
-          <w:numId w:val="2"/>
-        </w:numPr>
-        <w:spacing w:after="80" w:line="285"/>
-      </w:pPr>
-      <w:r>
-        <w:rPr>
-          <w:rFonts w:ascii="Calibri" w:cs="Calibri" w:eastAsia="Calibri" w:hAnsi="Calibri"/>
-          <w:sz w:val="21"/>
-          <w:szCs w:val="21"/>
-        </w:rPr>
-        <w:t xml:space="preserve">Incorporar la predicción de demanda y la importación de datos reales para comparar contra la simulación.</w:t>
-      </w:r>
-    </w:p>
-    <w:p>
-      <w:pPr>
-        <w:pStyle w:val="ListParagraph"/>
-        <w:numPr>
-          <w:ilvl w:val="0"/>
-          <w:numId w:val="2"/>
-        </w:numPr>
-        <w:spacing w:after="80" w:line="285"/>
-      </w:pPr>
-      <w:r>
-        <w:rPr>
-          <w:rFonts w:ascii="Calibri" w:cs="Calibri" w:eastAsia="Calibri" w:hAnsi="Calibri"/>
-          <w:sz w:val="21"/>
-          <w:szCs w:val="21"/>
-        </w:rPr>
-        <w:t xml:space="preserve">Hacer que los filtros de máquina y fecha afecten a los gráficos.</w:t>
-      </w:r>
-    </w:p>
-    <w:p>
-      <w:pPr>
-        <w:pStyle w:val="ListParagraph"/>
-        <w:numPr>
-          <w:ilvl w:val="0"/>
-          <w:numId w:val="2"/>
-        </w:numPr>
-        <w:spacing w:after="80" w:line="285"/>
-      </w:pPr>
-      <w:r>
-        <w:rPr>
-          <w:rFonts w:ascii="Calibri" w:cs="Calibri" w:eastAsia="Calibri" w:hAnsi="Calibri"/>
-          <w:sz w:val="21"/>
-          <w:szCs w:val="21"/>
-        </w:rPr>
-        <w:t xml:space="preserve">Decidir si el catálogo pasa a una estructura de carpetas por máquina.</w:t>
       </w:r>
     </w:p>
     <w:p>

</xml_diff>